<commit_message>
Use the real KYRGA logo across the app and both manuals
Adds the official KYRGA logo (public/logo-kyrga.png), points the brand at it,
and rebuilds the PT and EN manuals with the real logo on the cover and in all
screenshots (re-captured from the app with the demo data).

Co-Authored-By: Claude Opus 4.8 <noreply@anthropic.com>
Claude-Session: https://claude.ai/code/session_01RH98an53K9ERaUdwiwhfJV
</commit_message>
<xml_diff>
--- a/KYRGA_ASMS_User_Manual.docx
+++ b/KYRGA_ASMS_User_Manual.docx
@@ -11,7 +11,7 @@
       <w:r>
         <w:drawing>
           <wp:inline xmlns:a="http://schemas.openxmlformats.org/drawingml/2006/main" xmlns:pic="http://schemas.openxmlformats.org/drawingml/2006/picture">
-            <wp:extent cx="4754880" cy="1320800"/>
+            <wp:extent cx="4206240" cy="1356953"/>
             <wp:docPr id="1" name="Picture 1"/>
             <wp:cNvGraphicFramePr>
               <a:graphicFrameLocks noChangeAspect="1"/>
@@ -20,7 +20,7 @@
               <a:graphicData uri="http://schemas.openxmlformats.org/drawingml/2006/picture">
                 <pic:pic>
                   <pic:nvPicPr>
-                    <pic:cNvPr id="0" name="logo-kyrga.png"/>
+                    <pic:cNvPr id="0" name="logo-real.png"/>
                     <pic:cNvPicPr/>
                   </pic:nvPicPr>
                   <pic:blipFill>
@@ -32,7 +32,7 @@
                   <pic:spPr>
                     <a:xfrm>
                       <a:off x="0" y="0"/>
-                      <a:ext cx="4754880" cy="1320800"/>
+                      <a:ext cx="4206240" cy="1356953"/>
                     </a:xfrm>
                     <a:prstGeom prst="rect"/>
                   </pic:spPr>

</xml_diff>